<commit_message>
Pet-Study Models complete, update to many graphics also for the defense
Major update.
</commit_message>
<xml_diff>
--- a/Output/Tables/PAPER 1 - table2_abbreviated_PP_QCEasytrial.docx
+++ b/Output/Tables/PAPER 1 - table2_abbreviated_PP_QCEasytrial.docx
@@ -1081,7 +1081,7 @@
                 <w:szCs w:val="22"/>
                 <w:color w:val="000000"/>
               </w:rPr>
-              <w:t xml:space="preserve">Change in energy intake (kJ)</w:t>
+              <w:t xml:space="preserve">Change in energy intake (kcal)</w:t>
             </w:r>
           </w:p>
         </w:tc>
@@ -1125,7 +1125,7 @@
                 <w:szCs w:val="22"/>
                 <w:color w:val="000000"/>
               </w:rPr>
-              <w:t xml:space="preserve">-1040 (2670)</w:t>
+              <w:t xml:space="preserve">-248 (639)</w:t>
             </w:r>
           </w:p>
         </w:tc>
@@ -1169,7 +1169,7 @@
                 <w:szCs w:val="22"/>
                 <w:color w:val="000000"/>
               </w:rPr>
-              <w:t xml:space="preserve">-65.7 (1270)</w:t>
+              <w:t xml:space="preserve">-15.7 (305)</w:t>
             </w:r>
           </w:p>
         </w:tc>

</xml_diff>